<commit_message>
updated meeting logs, wrotee md and requirements.in
</commit_message>
<xml_diff>
--- a/documents/dsp-meeting-logs.docx
+++ b/documents/dsp-meeting-logs.docx
@@ -291,6 +291,112 @@
               <w:t>- Recorded viva for poster</w:t>
             </w:r>
           </w:p>
+          <w:p/>
+        </w:tc>
+      </w:tr>
+      <w:tr>
+        <w:tc>
+          <w:tcPr>
+            <w:tcW w:w="1838" w:type="dxa"/>
+          </w:tcPr>
+          <w:p>
+            <w:r>
+              <w:t>3/10/2026</w:t>
+            </w:r>
+          </w:p>
+        </w:tc>
+        <w:tc>
+          <w:tcPr>
+            <w:tcW w:w="3447" w:type="dxa"/>
+          </w:tcPr>
+          <w:p>
+            <w:r>
+              <w:t xml:space="preserve">- </w:t>
+            </w:r>
+            <w:r>
+              <w:t>Research similar product</w:t>
+            </w:r>
+          </w:p>
+          <w:p>
+            <w:r>
+              <w:t xml:space="preserve">- </w:t>
+            </w:r>
+            <w:r>
+              <w:t>Product system flow</w:t>
+            </w:r>
+          </w:p>
+          <w:p>
+            <w:r>
+              <w:t xml:space="preserve">- </w:t>
+            </w:r>
+            <w:r>
+              <w:t xml:space="preserve">Implement </w:t>
+            </w:r>
+            <w:r>
+              <w:t>UI</w:t>
+            </w:r>
+            <w:r>
+              <w:t xml:space="preserve"> designs</w:t>
+            </w:r>
+          </w:p>
+          <w:p>
+            <w:r>
+              <w:t xml:space="preserve">- </w:t>
+            </w:r>
+            <w:r>
+              <w:t>Specific architecture of RAG AI Agent</w:t>
+            </w:r>
+          </w:p>
+          <w:p>
+            <w:r>
+              <w:t xml:space="preserve">- </w:t>
+            </w:r>
+            <w:r>
+              <w:t>M</w:t>
+            </w:r>
+            <w:r>
+              <w:t xml:space="preserve">atching </w:t>
+            </w:r>
+            <w:r>
+              <w:t>CV to the corresponding Job Descriptions (could use datasets)</w:t>
+            </w:r>
+          </w:p>
+          <w:p>
+            <w:r>
+              <w:t xml:space="preserve">- </w:t>
+            </w:r>
+            <w:r>
+              <w:t>Identify core functionalities</w:t>
+            </w:r>
+            <w:r>
+              <w:t xml:space="preserve">: </w:t>
+            </w:r>
+            <w:r>
+              <w:t xml:space="preserve">CV reviews/answering questions related to the CV </w:t>
+            </w:r>
+            <w:r>
+              <w:t xml:space="preserve">+ matching </w:t>
+            </w:r>
+            <w:r>
+              <w:t>CV to JD</w:t>
+            </w:r>
+          </w:p>
+          <w:p>
+            <w:r>
+              <w:t xml:space="preserve">- </w:t>
+            </w:r>
+            <w:r>
+              <w:t>Try prompting/fine tune model</w:t>
+            </w:r>
+            <w:r>
+              <w:t xml:space="preserve"> </w:t>
+            </w:r>
+          </w:p>
+        </w:tc>
+        <w:tc>
+          <w:tcPr>
+            <w:tcW w:w="3731" w:type="dxa"/>
+          </w:tcPr>
           <w:p/>
         </w:tc>
       </w:tr>

</xml_diff>

<commit_message>
add product system flow explanation in readme
</commit_message>
<xml_diff>
--- a/documents/dsp-meeting-logs.docx
+++ b/documents/dsp-meeting-logs.docx
@@ -397,7 +397,50 @@
           <w:tcPr>
             <w:tcW w:w="3731" w:type="dxa"/>
           </w:tcPr>
-          <w:p/>
+          <w:p>
+            <w:r>
+              <w:t xml:space="preserve">- Researched similar products like LinkedIn, </w:t>
+            </w:r>
+            <w:r>
+              <w:t>jobright.ai</w:t>
+            </w:r>
+            <w:r>
+              <w:t>, etc.</w:t>
+            </w:r>
+          </w:p>
+          <w:p>
+            <w:r>
+              <w:t>- Implemented React + Tailwind CSS for frontend UI designs</w:t>
+            </w:r>
+          </w:p>
+          <w:p>
+            <w:r>
+              <w:t xml:space="preserve">- Matched CV + preferences to the corresponding Job Descriptions from </w:t>
+            </w:r>
+            <w:proofErr w:type="spellStart"/>
+            <w:r>
+              <w:t>lukebarousse</w:t>
+            </w:r>
+            <w:proofErr w:type="spellEnd"/>
+            <w:r>
+              <w:t>/</w:t>
+            </w:r>
+            <w:proofErr w:type="spellStart"/>
+            <w:r>
+              <w:t>data_jobs</w:t>
+            </w:r>
+            <w:proofErr w:type="spellEnd"/>
+          </w:p>
+          <w:p>
+            <w:r>
+              <w:t>- Better prompting with system rules, match cv to jobs, answer job question</w:t>
+            </w:r>
+          </w:p>
+          <w:p>
+            <w:r>
+              <w:t>- Explanation of product system flow in README.md</w:t>
+            </w:r>
+          </w:p>
         </w:tc>
       </w:tr>
     </w:tbl>

</xml_diff>

<commit_message>
adding recalculating function for changing job preference
</commit_message>
<xml_diff>
--- a/documents/dsp-meeting-logs.docx
+++ b/documents/dsp-meeting-logs.docx
@@ -301,7 +301,10 @@
           </w:tcPr>
           <w:p>
             <w:r>
-              <w:t>3/10/2026</w:t>
+              <w:t>10/3</w:t>
+            </w:r>
+            <w:r>
+              <w:t>/2026</w:t>
             </w:r>
           </w:p>
         </w:tc>
@@ -441,6 +444,40 @@
               <w:t>- Explanation of product system flow in README.md</w:t>
             </w:r>
           </w:p>
+        </w:tc>
+      </w:tr>
+      <w:tr>
+        <w:tc>
+          <w:tcPr>
+            <w:tcW w:w="1838" w:type="dxa"/>
+          </w:tcPr>
+          <w:p>
+            <w:r>
+              <w:t>24/3/2026</w:t>
+            </w:r>
+          </w:p>
+        </w:tc>
+        <w:tc>
+          <w:tcPr>
+            <w:tcW w:w="3447" w:type="dxa"/>
+          </w:tcPr>
+          <w:p>
+            <w:r>
+              <w:t>- Try research and implement agent for CV editing accordingly to the jobs matched, and ability to auto apply for the jobs</w:t>
+            </w:r>
+          </w:p>
+          <w:p>
+            <w:r>
+              <w:t>- Showing scores on the best matching jobs for the CV</w:t>
+            </w:r>
+          </w:p>
+          <w:p/>
+        </w:tc>
+        <w:tc>
+          <w:tcPr>
+            <w:tcW w:w="3731" w:type="dxa"/>
+          </w:tcPr>
+          <w:p/>
         </w:tc>
       </w:tr>
     </w:tbl>

</xml_diff>